<commit_message>
Added additional letter template for finance company
</commit_message>
<xml_diff>
--- a/docassemble/ReturnCarProperty/data/templates/request_property_in_car_letter.docx
+++ b/docassemble/ReturnCarProperty/data/templates/request_property_in_car_letter.docx
@@ -245,6 +245,9 @@
       <w:proofErr w:type="spellStart"/>
       <w:proofErr w:type="gramStart"/>
       <w:r>
+        <w:t>repo_</w:t>
+      </w:r>
+      <w:r>
         <w:t>company.name.first</w:t>
       </w:r>
       <w:proofErr w:type="spellEnd"/>
@@ -257,6 +260,9 @@
         <w:t>{{</w:t>
       </w:r>
       <w:proofErr w:type="spellStart"/>
+      <w:r>
+        <w:t>repo_</w:t>
+      </w:r>
       <w:proofErr w:type="gramStart"/>
       <w:r>
         <w:t>company.address</w:t>
@@ -274,6 +280,9 @@
         <w:t>{{</w:t>
       </w:r>
       <w:proofErr w:type="spellStart"/>
+      <w:r>
+        <w:t>repo_</w:t>
+      </w:r>
       <w:proofErr w:type="gramStart"/>
       <w:r>
         <w:t>company.address</w:t>
@@ -318,6 +327,12 @@
       </w:r>
       <w:proofErr w:type="spellStart"/>
       <w:proofErr w:type="gramStart"/>
+      <w:r>
+        <w:t>repo</w:t>
+      </w:r>
+      <w:r>
+        <w:t>_</w:t>
+      </w:r>
       <w:r>
         <w:t>company.name.first</w:t>
       </w:r>

</xml_diff>

<commit_message>
Added account number to user info heading
</commit_message>
<xml_diff>
--- a/docassemble/ReturnCarProperty/data/templates/request_property_in_car_letter.docx
+++ b/docassemble/ReturnCarProperty/data/templates/request_property_in_car_letter.docx
@@ -135,7 +135,15 @@
                 <w:sz w:val="24"/>
                 <w:szCs w:val="24"/>
               </w:rPr>
-              <w:t>{{users[0].</w:t>
+              <w:t>{{users[0</w:t>
+            </w:r>
+            <w:proofErr w:type="gramStart"/>
+            <w:r>
+              <w:rPr>
+                <w:sz w:val="24"/>
+                <w:szCs w:val="24"/>
+              </w:rPr>
+              <w:t>].</w:t>
             </w:r>
             <w:proofErr w:type="spellStart"/>
             <w:r>
@@ -143,7 +151,15 @@
                 <w:sz w:val="24"/>
                 <w:szCs w:val="24"/>
               </w:rPr>
-              <w:t>address.line_one</w:t>
+              <w:t>address</w:t>
+            </w:r>
+            <w:proofErr w:type="gramEnd"/>
+            <w:r>
+              <w:rPr>
+                <w:sz w:val="24"/>
+                <w:szCs w:val="24"/>
+              </w:rPr>
+              <w:t>.line_one</w:t>
             </w:r>
             <w:proofErr w:type="spellEnd"/>
             <w:r>
@@ -165,7 +181,15 @@
                 <w:sz w:val="24"/>
                 <w:szCs w:val="24"/>
               </w:rPr>
-              <w:t>{{users[0].</w:t>
+              <w:t>{{users[0</w:t>
+            </w:r>
+            <w:proofErr w:type="gramStart"/>
+            <w:r>
+              <w:rPr>
+                <w:sz w:val="24"/>
+                <w:szCs w:val="24"/>
+              </w:rPr>
+              <w:t>].</w:t>
             </w:r>
             <w:proofErr w:type="spellStart"/>
             <w:r>
@@ -173,7 +197,23 @@
                 <w:sz w:val="24"/>
                 <w:szCs w:val="24"/>
               </w:rPr>
-              <w:t>address.line_two</w:t>
+              <w:t>address</w:t>
+            </w:r>
+            <w:proofErr w:type="gramEnd"/>
+            <w:r>
+              <w:rPr>
+                <w:sz w:val="24"/>
+                <w:szCs w:val="24"/>
+              </w:rPr>
+              <w:t>.line_</w:t>
+            </w:r>
+            <w:proofErr w:type="gramStart"/>
+            <w:r>
+              <w:rPr>
+                <w:sz w:val="24"/>
+                <w:szCs w:val="24"/>
+              </w:rPr>
+              <w:t>two</w:t>
             </w:r>
             <w:proofErr w:type="spellEnd"/>
             <w:r>
@@ -181,7 +221,102 @@
                 <w:sz w:val="24"/>
                 <w:szCs w:val="24"/>
               </w:rPr>
-              <w:t>()}}</w:t>
+              <w:t>(</w:t>
+            </w:r>
+            <w:proofErr w:type="gramEnd"/>
+            <w:r>
+              <w:rPr>
+                <w:sz w:val="24"/>
+                <w:szCs w:val="24"/>
+              </w:rPr>
+              <w:t>)}}</w:t>
+            </w:r>
+            <w:r>
+              <w:rPr>
+                <w:sz w:val="24"/>
+                <w:szCs w:val="24"/>
+              </w:rPr>
+              <w:br/>
+            </w:r>
+            <w:r>
+              <w:rPr>
+                <w:sz w:val="24"/>
+                <w:szCs w:val="24"/>
+              </w:rPr>
+              <w:t xml:space="preserve">{% if </w:t>
+            </w:r>
+            <w:proofErr w:type="spellStart"/>
+            <w:r>
+              <w:rPr>
+                <w:sz w:val="24"/>
+                <w:szCs w:val="24"/>
+              </w:rPr>
+              <w:t>account_</w:t>
+            </w:r>
+            <w:proofErr w:type="gramStart"/>
+            <w:r>
+              <w:rPr>
+                <w:sz w:val="24"/>
+                <w:szCs w:val="24"/>
+              </w:rPr>
+              <w:t>number</w:t>
+            </w:r>
+            <w:proofErr w:type="spellEnd"/>
+            <w:r>
+              <w:rPr>
+                <w:sz w:val="24"/>
+                <w:szCs w:val="24"/>
+              </w:rPr>
+              <w:t xml:space="preserve"> !</w:t>
+            </w:r>
+            <w:proofErr w:type="gramEnd"/>
+            <w:r>
+              <w:rPr>
+                <w:sz w:val="24"/>
+                <w:szCs w:val="24"/>
+              </w:rPr>
+              <w:t xml:space="preserve">= “” </w:t>
+            </w:r>
+            <w:proofErr w:type="gramStart"/>
+            <w:r>
+              <w:rPr>
+                <w:sz w:val="24"/>
+                <w:szCs w:val="24"/>
+              </w:rPr>
+              <w:t>%}Account</w:t>
+            </w:r>
+            <w:proofErr w:type="gramEnd"/>
+            <w:r>
+              <w:rPr>
+                <w:sz w:val="24"/>
+                <w:szCs w:val="24"/>
+              </w:rPr>
+              <w:t xml:space="preserve"> number: {{</w:t>
+            </w:r>
+            <w:proofErr w:type="spellStart"/>
+            <w:r>
+              <w:rPr>
+                <w:sz w:val="24"/>
+                <w:szCs w:val="24"/>
+              </w:rPr>
+              <w:t>account_number</w:t>
+            </w:r>
+            <w:proofErr w:type="spellEnd"/>
+            <w:proofErr w:type="gramStart"/>
+            <w:r>
+              <w:rPr>
+                <w:sz w:val="24"/>
+                <w:szCs w:val="24"/>
+              </w:rPr>
+              <w:t>}}{</w:t>
+            </w:r>
+            <w:proofErr w:type="gramEnd"/>
+            <w:r>
+              <w:rPr>
+                <w:sz w:val="24"/>
+                <w:szCs w:val="24"/>
+              </w:rPr>
+              <w:t>% endif %}</w:t>
             </w:r>
           </w:p>
         </w:tc>
@@ -248,13 +383,7 @@
         <w:t>(bare=True)}}</w:t>
       </w:r>
       <w:r>
-        <w:t>{% else %}</w:t>
-      </w:r>
-      <w:r>
-        <w:t>___________________________</w:t>
-      </w:r>
-      <w:r>
-        <w:t>{% endif %}</w:t>
+        <w:t>{% else %}___________________________{% endif %}</w:t>
       </w:r>
       <w:r>
         <w:br/>
@@ -285,13 +414,7 @@
         <w:t>()}}</w:t>
       </w:r>
       <w:r>
-        <w:t>{% else %}</w:t>
-      </w:r>
-      <w:r>
-        <w:t>___________________________</w:t>
-      </w:r>
-      <w:r>
-        <w:t>{% endif %}</w:t>
+        <w:t>{% else %}___________________________{% endif %}</w:t>
       </w:r>
     </w:p>
     <w:p>
@@ -312,11 +435,16 @@
       <w:pPr>
         <w:pStyle w:val="NormalWeb"/>
       </w:pPr>
+      <w:proofErr w:type="gramStart"/>
       <w:r>
         <w:t xml:space="preserve">Dear </w:t>
       </w:r>
       <w:r>
-        <w:t xml:space="preserve">{% if </w:t>
+        <w:t>{%</w:t>
+      </w:r>
+      <w:proofErr w:type="gramEnd"/>
+      <w:r>
+        <w:t xml:space="preserve"> if </w:t>
       </w:r>
       <w:proofErr w:type="spellStart"/>
       <w:r>
@@ -324,12 +452,21 @@
       </w:r>
       <w:proofErr w:type="spellEnd"/>
       <w:r>
-        <w:t xml:space="preserve"> %}</w:t>
-      </w:r>
-      <w:r>
-        <w:t>{{</w:t>
+        <w:t xml:space="preserve"> </w:t>
+      </w:r>
+      <w:proofErr w:type="gramStart"/>
+      <w:r>
+        <w:t>%}</w:t>
+      </w:r>
+      <w:r>
+        <w:t>{</w:t>
+      </w:r>
+      <w:proofErr w:type="gramEnd"/>
+      <w:r>
+        <w:t>{</w:t>
       </w:r>
       <w:proofErr w:type="spellStart"/>
+      <w:proofErr w:type="gramStart"/>
       <w:r>
         <w:t>repo</w:t>
       </w:r>
@@ -344,14 +481,33 @@
         <w:t>}}</w:t>
       </w:r>
       <w:r>
-        <w:t>{% else %}</w:t>
-      </w:r>
-      <w:r>
-        <w:t>___________________________</w:t>
-      </w:r>
-      <w:r>
-        <w:t>{% endif %}</w:t>
-      </w:r>
+        <w:t>{</w:t>
+      </w:r>
+      <w:proofErr w:type="gramEnd"/>
+      <w:r>
+        <w:t xml:space="preserve">% else </w:t>
+      </w:r>
+      <w:proofErr w:type="gramStart"/>
+      <w:r>
+        <w:t>%}_</w:t>
+      </w:r>
+      <w:proofErr w:type="gramEnd"/>
+      <w:r>
+        <w:t>_________________________</w:t>
+      </w:r>
+      <w:proofErr w:type="gramStart"/>
+      <w:r>
+        <w:t>_{</w:t>
+      </w:r>
+      <w:proofErr w:type="gramEnd"/>
+      <w:r>
+        <w:t xml:space="preserve">% </w:t>
+      </w:r>
+      <w:proofErr w:type="gramStart"/>
+      <w:r>
+        <w:t>endif %}</w:t>
+      </w:r>
+      <w:proofErr w:type="gramEnd"/>
       <w:r>
         <w:t>:</w:t>
       </w:r>
@@ -419,7 +575,11 @@
       </w:r>
       <w:proofErr w:type="spellStart"/>
       <w:r>
-        <w:t>repo_date</w:t>
+        <w:t>repo_</w:t>
+      </w:r>
+      <w:proofErr w:type="gramStart"/>
+      <w:r>
+        <w:t>date</w:t>
       </w:r>
       <w:proofErr w:type="spellEnd"/>
       <w:r>
@@ -428,6 +588,7 @@
       <w:r>
         <w:t>.</w:t>
       </w:r>
+      <w:proofErr w:type="gramEnd"/>
       <w:r>
         <w:t xml:space="preserve"> </w:t>
       </w:r>
@@ -515,7 +676,21 @@
         <w:rPr>
           <w:color w:val="000000"/>
         </w:rPr>
-        <w:t>Per the Act, your company must provide a written inventory of all personal items found in the car. This inventory must  be given to me within a reasonable time frame. This helps ensure my property is protected and safely returned</w:t>
+        <w:t xml:space="preserve">Per the Act, your company must provide a written inventory of all personal items found in the car. This inventory </w:t>
+      </w:r>
+      <w:proofErr w:type="gramStart"/>
+      <w:r>
+        <w:rPr>
+          <w:color w:val="000000"/>
+        </w:rPr>
+        <w:t>must  be</w:t>
+      </w:r>
+      <w:proofErr w:type="gramEnd"/>
+      <w:r>
+        <w:rPr>
+          <w:color w:val="000000"/>
+        </w:rPr>
+        <w:t xml:space="preserve"> given to me within a reasonable time frame. This helps ensure my property is protected and safely returned</w:t>
       </w:r>
       <w:r>
         <w:rPr>
@@ -578,27 +753,97 @@
         <w:rPr>
           <w:color w:val="000000"/>
         </w:rPr>
-        <w:t>{% if users[0].</w:t>
+        <w:t xml:space="preserve">{% if </w:t>
+      </w:r>
+      <w:proofErr w:type="gramStart"/>
+      <w:r>
+        <w:rPr>
+          <w:color w:val="000000"/>
+        </w:rPr>
+        <w:t>users[</w:t>
+      </w:r>
+      <w:proofErr w:type="gramEnd"/>
+      <w:r>
+        <w:rPr>
+          <w:color w:val="000000"/>
+        </w:rPr>
+        <w:t>0</w:t>
+      </w:r>
+      <w:proofErr w:type="gramStart"/>
+      <w:r>
+        <w:rPr>
+          <w:color w:val="000000"/>
+        </w:rPr>
+        <w:t>].</w:t>
       </w:r>
       <w:proofErr w:type="spellStart"/>
       <w:r>
         <w:rPr>
           <w:color w:val="000000"/>
         </w:rPr>
-        <w:t>phone_number</w:t>
+        <w:t>phone</w:t>
+      </w:r>
+      <w:proofErr w:type="gramEnd"/>
+      <w:r>
+        <w:rPr>
+          <w:color w:val="000000"/>
+        </w:rPr>
+        <w:t>_number</w:t>
       </w:r>
       <w:proofErr w:type="spellEnd"/>
       <w:r>
         <w:rPr>
           <w:color w:val="000000"/>
         </w:rPr>
-        <w:t xml:space="preserve"> == “” and users[0].email == “” %}</w:t>
-      </w:r>
-      <w:r>
-        <w:rPr>
-          <w:color w:val="000000"/>
-        </w:rPr>
-        <w:t>Please address your reply to the mailing address above</w:t>
+        <w:t xml:space="preserve"> == “” and </w:t>
+      </w:r>
+      <w:proofErr w:type="gramStart"/>
+      <w:r>
+        <w:rPr>
+          <w:color w:val="000000"/>
+        </w:rPr>
+        <w:t>users[</w:t>
+      </w:r>
+      <w:proofErr w:type="gramEnd"/>
+      <w:r>
+        <w:rPr>
+          <w:color w:val="000000"/>
+        </w:rPr>
+        <w:t>0</w:t>
+      </w:r>
+      <w:proofErr w:type="gramStart"/>
+      <w:r>
+        <w:rPr>
+          <w:color w:val="000000"/>
+        </w:rPr>
+        <w:t>].email</w:t>
+      </w:r>
+      <w:proofErr w:type="gramEnd"/>
+      <w:r>
+        <w:rPr>
+          <w:color w:val="000000"/>
+        </w:rPr>
+        <w:t xml:space="preserve"> == “” </w:t>
+      </w:r>
+      <w:proofErr w:type="gramStart"/>
+      <w:r>
+        <w:rPr>
+          <w:color w:val="000000"/>
+        </w:rPr>
+        <w:t>%}</w:t>
+      </w:r>
+      <w:r>
+        <w:rPr>
+          <w:color w:val="000000"/>
+        </w:rPr>
+        <w:t>Please</w:t>
+      </w:r>
+      <w:proofErr w:type="gramEnd"/>
+      <w:r>
+        <w:rPr>
+          <w:color w:val="000000"/>
+        </w:rPr>
+        <w:t xml:space="preserve"> address your reply to the mailing address above</w:t>
       </w:r>
       <w:r>
         <w:rPr>
@@ -610,8 +855,44 @@
         <w:rPr>
           <w:color w:val="000000"/>
         </w:rPr>
-        <w:t xml:space="preserve"> {% else %}My mailing address can be found above, and additional contact information can be found below my signature.{% endif %}</w:t>
-      </w:r>
+        <w:t xml:space="preserve"> {% else </w:t>
+      </w:r>
+      <w:proofErr w:type="gramStart"/>
+      <w:r>
+        <w:rPr>
+          <w:color w:val="000000"/>
+        </w:rPr>
+        <w:t>%}My</w:t>
+      </w:r>
+      <w:proofErr w:type="gramEnd"/>
+      <w:r>
+        <w:rPr>
+          <w:color w:val="000000"/>
+        </w:rPr>
+        <w:t xml:space="preserve"> mailing address can be found above, and additional contact information can be found below my </w:t>
+      </w:r>
+      <w:proofErr w:type="gramStart"/>
+      <w:r>
+        <w:rPr>
+          <w:color w:val="000000"/>
+        </w:rPr>
+        <w:t>signature.{</w:t>
+      </w:r>
+      <w:proofErr w:type="gramEnd"/>
+      <w:r>
+        <w:rPr>
+          <w:color w:val="000000"/>
+        </w:rPr>
+        <w:t xml:space="preserve">% </w:t>
+      </w:r>
+      <w:proofErr w:type="gramStart"/>
+      <w:r>
+        <w:rPr>
+          <w:color w:val="000000"/>
+        </w:rPr>
+        <w:t>endif %}</w:t>
+      </w:r>
+      <w:proofErr w:type="gramEnd"/>
     </w:p>
     <w:p>
       <w:pPr>
@@ -665,19 +946,59 @@
       </w:r>
       <w:proofErr w:type="spellStart"/>
       <w:r>
-        <w:t>name_full</w:t>
+        <w:t>name_</w:t>
+      </w:r>
+      <w:proofErr w:type="gramStart"/>
+      <w:r>
+        <w:t>full</w:t>
       </w:r>
       <w:proofErr w:type="spellEnd"/>
       <w:r>
-        <w:t>()}}{% if users[0].</w:t>
+        <w:t>(</w:t>
+      </w:r>
+      <w:proofErr w:type="gramEnd"/>
+      <w:r>
+        <w:t>)</w:t>
+      </w:r>
+      <w:proofErr w:type="gramStart"/>
+      <w:r>
+        <w:t>}}{</w:t>
+      </w:r>
+      <w:proofErr w:type="gramEnd"/>
+      <w:r>
+        <w:t xml:space="preserve">% if </w:t>
+      </w:r>
+      <w:proofErr w:type="gramStart"/>
+      <w:r>
+        <w:t>users[</w:t>
+      </w:r>
+      <w:proofErr w:type="gramEnd"/>
+      <w:r>
+        <w:t>0</w:t>
+      </w:r>
+      <w:proofErr w:type="gramStart"/>
+      <w:r>
+        <w:t>].</w:t>
       </w:r>
       <w:proofErr w:type="spellStart"/>
       <w:r>
-        <w:t>phone_number</w:t>
+        <w:t>phone</w:t>
+      </w:r>
+      <w:proofErr w:type="gramEnd"/>
+      <w:r>
+        <w:t>_</w:t>
+      </w:r>
+      <w:proofErr w:type="gramStart"/>
+      <w:r>
+        <w:t>number</w:t>
       </w:r>
       <w:proofErr w:type="spellEnd"/>
       <w:r>
-        <w:t xml:space="preserve"> != “” %}</w:t>
+        <w:t xml:space="preserve"> !</w:t>
+      </w:r>
+      <w:proofErr w:type="gramEnd"/>
+      <w:r>
+        <w:t>= “” %}</w:t>
       </w:r>
       <w:r>
         <w:rPr>
@@ -716,27 +1037,76 @@
         <w:rPr>
           <w:color w:val="000000"/>
         </w:rPr>
-        <w:t>(users[0].</w:t>
+        <w:t>(users[0</w:t>
+      </w:r>
+      <w:proofErr w:type="gramStart"/>
+      <w:r>
+        <w:rPr>
+          <w:color w:val="000000"/>
+        </w:rPr>
+        <w:t>].</w:t>
       </w:r>
       <w:proofErr w:type="spellStart"/>
       <w:r>
         <w:rPr>
           <w:color w:val="000000"/>
         </w:rPr>
-        <w:t>phone_number</w:t>
+        <w:t>phone</w:t>
+      </w:r>
+      <w:proofErr w:type="gramEnd"/>
+      <w:r>
+        <w:rPr>
+          <w:color w:val="000000"/>
+        </w:rPr>
+        <w:t>_number</w:t>
       </w:r>
       <w:proofErr w:type="spellEnd"/>
       <w:r>
         <w:rPr>
           <w:color w:val="000000"/>
         </w:rPr>
-        <w:t>)}}</w:t>
-      </w:r>
-      <w:r>
-        <w:t>{% endif %}{% if users[0].</w:t>
-      </w:r>
-      <w:r>
-        <w:t>email != “”</w:t>
+        <w:t>)</w:t>
+      </w:r>
+      <w:proofErr w:type="gramStart"/>
+      <w:r>
+        <w:rPr>
+          <w:color w:val="000000"/>
+        </w:rPr>
+        <w:t>}}</w:t>
+      </w:r>
+      <w:r>
+        <w:t>{</w:t>
+      </w:r>
+      <w:proofErr w:type="gramEnd"/>
+      <w:r>
+        <w:t xml:space="preserve">% endif </w:t>
+      </w:r>
+      <w:proofErr w:type="gramStart"/>
+      <w:r>
+        <w:t>%}{</w:t>
+      </w:r>
+      <w:proofErr w:type="gramEnd"/>
+      <w:r>
+        <w:t xml:space="preserve">% if </w:t>
+      </w:r>
+      <w:proofErr w:type="gramStart"/>
+      <w:r>
+        <w:t>users[</w:t>
+      </w:r>
+      <w:proofErr w:type="gramEnd"/>
+      <w:r>
+        <w:t>0</w:t>
+      </w:r>
+      <w:proofErr w:type="gramStart"/>
+      <w:r>
+        <w:t>].</w:t>
+      </w:r>
+      <w:r>
+        <w:t>email !=</w:t>
+      </w:r>
+      <w:proofErr w:type="gramEnd"/>
+      <w:r>
+        <w:t xml:space="preserve"> “”</w:t>
       </w:r>
       <w:r>
         <w:t xml:space="preserve"> %}</w:t>
@@ -749,7 +1119,15 @@
         <w:br/>
       </w:r>
       <w:r>
-        <w:t>{{users[0].email}}{% endif %</w:t>
+        <w:t>{{users[0</w:t>
+      </w:r>
+      <w:proofErr w:type="gramStart"/>
+      <w:r>
+        <w:t>].email}}{</w:t>
+      </w:r>
+      <w:proofErr w:type="gramEnd"/>
+      <w:r>
+        <w:t>% endif %</w:t>
       </w:r>
       <w:r>
         <w:t>}</w:t>

</xml_diff>